<commit_message>
moved into enum for status and add approve and support status and using enum
</commit_message>
<xml_diff>
--- a/design/technical-design-note.docx
+++ b/design/technical-design-note.docx
@@ -724,25 +724,7 @@
           <w:u w:val="none"/>
           <w:shd w:fill="FFFF00" w:val="clear"/>
         </w:rPr>
-        <w:t>T30T10_supported_by</w:t>
-      </w:r>
-      <w:r>
-        <w:rPr>
-          <w:b w:val="false"/>
-          <w:bCs w:val="false"/>
-          <w:u w:val="none"/>
-          <w:shd w:fill="FFFF00" w:val="clear"/>
-        </w:rPr>
-        <w:t>_id</w:t>
-      </w:r>
-      <w:r>
-        <w:rPr>
-          <w:b w:val="false"/>
-          <w:bCs w:val="false"/>
-          <w:u w:val="none"/>
-          <w:shd w:fill="FFFF00" w:val="clear"/>
-        </w:rPr>
-        <w:t xml:space="preserve"> FK</w:t>
+        <w:t>T30T10_supported_by_id FK</w:t>
       </w:r>
     </w:p>
     <w:p>
@@ -790,49 +772,91 @@
           <w:u w:val="none"/>
           <w:shd w:fill="FFFF00" w:val="clear"/>
         </w:rPr>
-        <w:t>T30_supported_at (date)</w:t>
-      </w:r>
-    </w:p>
-    <w:p>
-      <w:pPr>
-        <w:pStyle w:val="Normal"/>
-        <w:bidi w:val="0"/>
-        <w:jc w:val="left"/>
-        <w:rPr>
-          <w:b w:val="false"/>
-          <w:b w:val="false"/>
-          <w:bCs w:val="false"/>
-          <w:highlight w:val="none"/>
-          <w:u w:val="none"/>
-          <w:shd w:fill="FFFF00" w:val="clear"/>
-        </w:rPr>
-      </w:pPr>
-      <w:r>
-        <w:rPr>
-          <w:b w:val="false"/>
-          <w:bCs w:val="false"/>
-          <w:u w:val="none"/>
-          <w:shd w:fill="FFFF00" w:val="clear"/>
-        </w:rPr>
-        <w:t>T30T10_approved_by</w:t>
-      </w:r>
-      <w:r>
-        <w:rPr>
-          <w:b w:val="false"/>
-          <w:bCs w:val="false"/>
-          <w:u w:val="none"/>
-          <w:shd w:fill="FFFF00" w:val="clear"/>
-        </w:rPr>
-        <w:t>_id</w:t>
-      </w:r>
-      <w:r>
-        <w:rPr>
-          <w:b w:val="false"/>
-          <w:bCs w:val="false"/>
-          <w:u w:val="none"/>
-          <w:shd w:fill="FFFF00" w:val="clear"/>
-        </w:rPr>
-        <w:t xml:space="preserve"> FK</w:t>
+        <w:t>T30_supported_status(</w:t>
+      </w:r>
+      <w:r>
+        <w:rPr>
+          <w:b w:val="false"/>
+          <w:bCs w:val="false"/>
+          <w:u w:val="none"/>
+          <w:shd w:fill="FFFF00" w:val="clear"/>
+        </w:rPr>
+        <w:t>enum</w:t>
+      </w:r>
+      <w:r>
+        <w:rPr>
+          <w:b w:val="false"/>
+          <w:bCs w:val="false"/>
+          <w:u w:val="none"/>
+          <w:shd w:fill="FFFF00" w:val="clear"/>
+        </w:rPr>
+        <w:t>)</w:t>
+      </w:r>
+    </w:p>
+    <w:p>
+      <w:pPr>
+        <w:pStyle w:val="Normal"/>
+        <w:bidi w:val="0"/>
+        <w:jc w:val="left"/>
+        <w:rPr>
+          <w:b w:val="false"/>
+          <w:b w:val="false"/>
+          <w:bCs w:val="false"/>
+          <w:highlight w:val="none"/>
+          <w:u w:val="none"/>
+          <w:shd w:fill="FFFF00" w:val="clear"/>
+        </w:rPr>
+      </w:pPr>
+      <w:r>
+        <w:rPr>
+          <w:b w:val="false"/>
+          <w:bCs w:val="false"/>
+          <w:u w:val="none"/>
+          <w:shd w:fill="FFFF00" w:val="clear"/>
+        </w:rPr>
+        <w:t>T30_supported_at (</w:t>
+      </w:r>
+      <w:r>
+        <w:rPr>
+          <w:b w:val="false"/>
+          <w:bCs w:val="false"/>
+          <w:u w:val="none"/>
+          <w:shd w:fill="FFFF00" w:val="clear"/>
+        </w:rPr>
+        <w:t>timestamp</w:t>
+      </w:r>
+      <w:r>
+        <w:rPr>
+          <w:b w:val="false"/>
+          <w:bCs w:val="false"/>
+          <w:u w:val="none"/>
+          <w:shd w:fill="FFFF00" w:val="clear"/>
+        </w:rPr>
+        <w:t>)</w:t>
+      </w:r>
+    </w:p>
+    <w:p>
+      <w:pPr>
+        <w:pStyle w:val="Normal"/>
+        <w:bidi w:val="0"/>
+        <w:jc w:val="left"/>
+        <w:rPr>
+          <w:b w:val="false"/>
+          <w:b w:val="false"/>
+          <w:bCs w:val="false"/>
+          <w:highlight w:val="none"/>
+          <w:u w:val="none"/>
+          <w:shd w:fill="FFFF00" w:val="clear"/>
+        </w:rPr>
+      </w:pPr>
+      <w:r>
+        <w:rPr>
+          <w:b w:val="false"/>
+          <w:bCs w:val="false"/>
+          <w:u w:val="none"/>
+          <w:shd w:fill="FFFF00" w:val="clear"/>
+        </w:rPr>
+        <w:t>T30T10_approved_by_id FK</w:t>
       </w:r>
     </w:p>
     <w:p>
@@ -880,7 +904,91 @@
           <w:u w:val="none"/>
           <w:shd w:fill="FFFF00" w:val="clear"/>
         </w:rPr>
-        <w:t>T30_approved_at (date)</w:t>
+        <w:t>T30_approved_status(</w:t>
+      </w:r>
+      <w:r>
+        <w:rPr>
+          <w:b w:val="false"/>
+          <w:bCs w:val="false"/>
+          <w:u w:val="none"/>
+          <w:shd w:fill="FFFF00" w:val="clear"/>
+        </w:rPr>
+        <w:t>enum</w:t>
+      </w:r>
+      <w:r>
+        <w:rPr>
+          <w:b w:val="false"/>
+          <w:bCs w:val="false"/>
+          <w:u w:val="none"/>
+          <w:shd w:fill="FFFF00" w:val="clear"/>
+        </w:rPr>
+        <w:t>)</w:t>
+      </w:r>
+    </w:p>
+    <w:p>
+      <w:pPr>
+        <w:pStyle w:val="Normal"/>
+        <w:bidi w:val="0"/>
+        <w:jc w:val="left"/>
+        <w:rPr>
+          <w:b w:val="false"/>
+          <w:b w:val="false"/>
+          <w:bCs w:val="false"/>
+          <w:highlight w:val="none"/>
+          <w:u w:val="none"/>
+          <w:shd w:fill="FFFF00" w:val="clear"/>
+        </w:rPr>
+      </w:pPr>
+      <w:r>
+        <w:rPr>
+          <w:b w:val="false"/>
+          <w:bCs w:val="false"/>
+          <w:u w:val="none"/>
+          <w:shd w:fill="FFFF00" w:val="clear"/>
+        </w:rPr>
+        <w:t>T30_approved_at (</w:t>
+      </w:r>
+      <w:r>
+        <w:rPr>
+          <w:b w:val="false"/>
+          <w:bCs w:val="false"/>
+          <w:u w:val="none"/>
+          <w:shd w:fill="FFFF00" w:val="clear"/>
+        </w:rPr>
+        <w:t>timestamp</w:t>
+      </w:r>
+      <w:r>
+        <w:rPr>
+          <w:b w:val="false"/>
+          <w:bCs w:val="false"/>
+          <w:u w:val="none"/>
+          <w:shd w:fill="FFFF00" w:val="clear"/>
+        </w:rPr>
+        <w:t>)</w:t>
+      </w:r>
+    </w:p>
+    <w:p>
+      <w:pPr>
+        <w:pStyle w:val="Normal"/>
+        <w:bidi w:val="0"/>
+        <w:jc w:val="left"/>
+        <w:rPr>
+          <w:b w:val="false"/>
+          <w:b w:val="false"/>
+          <w:bCs w:val="false"/>
+          <w:highlight w:val="none"/>
+          <w:u w:val="none"/>
+          <w:shd w:fill="FFFF00" w:val="clear"/>
+        </w:rPr>
+      </w:pPr>
+      <w:r>
+        <w:rPr>
+          <w:b w:val="false"/>
+          <w:bCs w:val="false"/>
+          <w:u w:val="none"/>
+          <w:shd w:fill="FFFF00" w:val="clear"/>
+        </w:rPr>
+        <w:t>T30_status(enum)</w:t>
       </w:r>
     </w:p>
     <w:p>

</xml_diff>